<commit_message>
Cập nhật luồng ứng và mẫu biên bản
</commit_message>
<xml_diff>
--- a/templates/bbnt-do-template.docx
+++ b/templates/bbnt-do-template.docx
@@ -18,12 +18,6 @@
         <w:gridCol w:w="5000"/>
       </w:tblGrid>
       <w:tr>
-        <w:tblPrEx>
-          <w:tblCellMar>
-            <w:top w:w="0" w:type="dxa"/>
-            <w:bottom w:w="0" w:type="dxa"/>
-          </w:tblCellMar>
-        </w:tblPrEx>
         <w:tc>
           <w:tcPr>
             <w:tcW w:w="4700" w:type="dxa"/>
@@ -92,12 +86,6 @@
         </w:tc>
       </w:tr>
       <w:tr>
-        <w:tblPrEx>
-          <w:tblCellMar>
-            <w:top w:w="0" w:type="dxa"/>
-            <w:bottom w:w="0" w:type="dxa"/>
-          </w:tblCellMar>
-        </w:tblPrEx>
         <w:tc>
           <w:tcPr>
             <w:tcW w:w="4700" w:type="dxa"/>
@@ -1086,12 +1074,6 @@
         <w:gridCol w:w="1700"/>
       </w:tblGrid>
       <w:tr>
-        <w:tblPrEx>
-          <w:tblCellMar>
-            <w:top w:w="0" w:type="dxa"/>
-            <w:bottom w:w="0" w:type="dxa"/>
-          </w:tblCellMar>
-        </w:tblPrEx>
         <w:tc>
           <w:tcPr>
             <w:tcW w:w="700" w:type="dxa"/>
@@ -1199,12 +1181,6 @@
         </w:tc>
       </w:tr>
       <w:tr>
-        <w:tblPrEx>
-          <w:tblCellMar>
-            <w:top w:w="0" w:type="dxa"/>
-            <w:bottom w:w="0" w:type="dxa"/>
-          </w:tblCellMar>
-        </w:tblPrEx>
         <w:tc>
           <w:tcPr>
             <w:tcW w:w="700" w:type="dxa"/>
@@ -1280,12 +1256,6 @@
         </w:tc>
       </w:tr>
       <w:tr>
-        <w:tblPrEx>
-          <w:tblCellMar>
-            <w:top w:w="0" w:type="dxa"/>
-            <w:bottom w:w="0" w:type="dxa"/>
-          </w:tblCellMar>
-        </w:tblPrEx>
         <w:tc>
           <w:tcPr>
             <w:tcW w:w="700" w:type="dxa"/>
@@ -1353,12 +1323,6 @@
         </w:tc>
       </w:tr>
       <w:tr>
-        <w:tblPrEx>
-          <w:tblCellMar>
-            <w:top w:w="0" w:type="dxa"/>
-            <w:bottom w:w="0" w:type="dxa"/>
-          </w:tblCellMar>
-        </w:tblPrEx>
         <w:tc>
           <w:tcPr>
             <w:tcW w:w="700" w:type="dxa"/>
@@ -1434,12 +1398,6 @@
         </w:tc>
       </w:tr>
       <w:tr>
-        <w:tblPrEx>
-          <w:tblCellMar>
-            <w:top w:w="0" w:type="dxa"/>
-            <w:bottom w:w="0" w:type="dxa"/>
-          </w:tblCellMar>
-        </w:tblPrEx>
         <w:tc>
           <w:tcPr>
             <w:tcW w:w="700" w:type="dxa"/>
@@ -1507,12 +1465,6 @@
         </w:tc>
       </w:tr>
       <w:tr>
-        <w:tblPrEx>
-          <w:tblCellMar>
-            <w:top w:w="0" w:type="dxa"/>
-            <w:bottom w:w="0" w:type="dxa"/>
-          </w:tblCellMar>
-        </w:tblPrEx>
         <w:tc>
           <w:tcPr>
             <w:tcW w:w="700" w:type="dxa"/>
@@ -1588,12 +1540,6 @@
         </w:tc>
       </w:tr>
       <w:tr>
-        <w:tblPrEx>
-          <w:tblCellMar>
-            <w:top w:w="0" w:type="dxa"/>
-            <w:bottom w:w="0" w:type="dxa"/>
-          </w:tblCellMar>
-        </w:tblPrEx>
         <w:tc>
           <w:tcPr>
             <w:tcW w:w="700" w:type="dxa"/>
@@ -1790,6 +1736,11 @@
       <w:pPr>
         <w:spacing w:after="60" w:line="276" w:lineRule="auto"/>
         <w:ind w:left="567"/>
+        <w:rPr>
+          <w:rFonts w:ascii="Times New Roman" w:hAnsi="Times New Roman" w:cs="Times New Roman"/>
+          <w:sz w:val="26"/>
+          <w:szCs w:val="26"/>
+        </w:rPr>
       </w:pPr>
       <w:r>
         <w:rPr>
@@ -1813,7 +1764,8 @@
     </w:p>
     <w:p>
       <w:pPr>
-        <w:spacing w:after="120" w:line="276" w:lineRule="auto"/>
+        <w:spacing w:after="60" w:line="276" w:lineRule="auto"/>
+        <w:ind w:left="567"/>
       </w:pPr>
     </w:p>
     <w:tbl>
@@ -1832,12 +1784,6 @@
         <w:gridCol w:w="4850"/>
       </w:tblGrid>
       <w:tr>
-        <w:tblPrEx>
-          <w:tblCellMar>
-            <w:top w:w="0" w:type="dxa"/>
-            <w:bottom w:w="0" w:type="dxa"/>
-          </w:tblCellMar>
-        </w:tblPrEx>
         <w:tc>
           <w:tcPr>
             <w:tcW w:w="4850" w:type="dxa"/>
@@ -1882,12 +1828,6 @@
         </w:tc>
       </w:tr>
       <w:tr>
-        <w:tblPrEx>
-          <w:tblCellMar>
-            <w:top w:w="0" w:type="dxa"/>
-            <w:bottom w:w="0" w:type="dxa"/>
-          </w:tblCellMar>
-        </w:tblPrEx>
         <w:tc>
           <w:tcPr>
             <w:tcW w:w="4850" w:type="dxa"/>
@@ -1897,6 +1837,17 @@
             <w:pPr>
               <w:spacing w:after="0" w:line="276" w:lineRule="auto"/>
               <w:jc w:val="center"/>
+              <w:rPr>
+                <w:rFonts w:ascii="Times New Roman" w:hAnsi="Times New Roman" w:cs="Times New Roman"/>
+                <w:sz w:val="26"/>
+                <w:szCs w:val="26"/>
+              </w:rPr>
+            </w:pPr>
+          </w:p>
+          <w:p>
+            <w:pPr>
+              <w:spacing w:after="0" w:line="276" w:lineRule="auto"/>
+              <w:jc w:val="center"/>
             </w:pPr>
             <w:r>
               <w:rPr>
@@ -1925,6 +1876,11 @@
             <w:pPr>
               <w:spacing w:after="0" w:line="276" w:lineRule="auto"/>
               <w:jc w:val="center"/>
+              <w:rPr>
+                <w:rFonts w:ascii="Times New Roman" w:hAnsi="Times New Roman" w:cs="Times New Roman"/>
+                <w:sz w:val="26"/>
+                <w:szCs w:val="26"/>
+              </w:rPr>
             </w:pPr>
             <w:r>
               <w:rPr>
@@ -1935,6 +1891,12 @@
               <w:t>{{/coChuKyQuanDoc}}</w:t>
             </w:r>
           </w:p>
+          <w:p>
+            <w:pPr>
+              <w:spacing w:after="0" w:line="276" w:lineRule="auto"/>
+              <w:jc w:val="center"/>
+            </w:pPr>
+          </w:p>
         </w:tc>
         <w:tc>
           <w:tcPr>
@@ -1945,6 +1907,17 @@
             <w:pPr>
               <w:spacing w:after="0" w:line="276" w:lineRule="auto"/>
               <w:jc w:val="center"/>
+              <w:rPr>
+                <w:rFonts w:ascii="Times New Roman" w:hAnsi="Times New Roman" w:cs="Times New Roman"/>
+                <w:sz w:val="26"/>
+                <w:szCs w:val="26"/>
+              </w:rPr>
+            </w:pPr>
+          </w:p>
+          <w:p>
+            <w:pPr>
+              <w:spacing w:after="0" w:line="276" w:lineRule="auto"/>
+              <w:jc w:val="center"/>
             </w:pPr>
             <w:r>
               <w:rPr>
@@ -1973,6 +1946,11 @@
             <w:pPr>
               <w:spacing w:after="0" w:line="276" w:lineRule="auto"/>
               <w:jc w:val="center"/>
+              <w:rPr>
+                <w:rFonts w:ascii="Times New Roman" w:hAnsi="Times New Roman" w:cs="Times New Roman"/>
+                <w:sz w:val="26"/>
+                <w:szCs w:val="26"/>
+              </w:rPr>
             </w:pPr>
             <w:r>
               <w:rPr>
@@ -1982,16 +1960,16 @@
               </w:rPr>
               <w:t>{{/coChuKyNguoiLap}}</w:t>
             </w:r>
+          </w:p>
+          <w:p>
+            <w:pPr>
+              <w:spacing w:after="0" w:line="276" w:lineRule="auto"/>
+              <w:jc w:val="center"/>
+            </w:pPr>
           </w:p>
         </w:tc>
       </w:tr>
       <w:tr>
-        <w:tblPrEx>
-          <w:tblCellMar>
-            <w:top w:w="0" w:type="dxa"/>
-            <w:bottom w:w="0" w:type="dxa"/>
-          </w:tblCellMar>
-        </w:tblPrEx>
         <w:tc>
           <w:tcPr>
             <w:tcW w:w="4850" w:type="dxa"/>
@@ -2036,12 +2014,6 @@
         </w:tc>
       </w:tr>
       <w:tr>
-        <w:tblPrEx>
-          <w:tblCellMar>
-            <w:top w:w="0" w:type="dxa"/>
-            <w:bottom w:w="0" w:type="dxa"/>
-          </w:tblCellMar>
-        </w:tblPrEx>
         <w:tc>
           <w:tcPr>
             <w:tcW w:w="4850" w:type="dxa"/>
@@ -2050,21 +2022,78 @@
           <w:p>
             <w:pPr>
               <w:spacing w:after="0" w:line="276" w:lineRule="auto"/>
-            </w:pPr>
-          </w:p>
+              <w:jc w:val="center"/>
+            </w:pPr>
+            <w:r>
+              <w:rPr>
+                <w:rFonts w:ascii="Times New Roman" w:hAnsi="Times New Roman" w:cs="Times New Roman"/>
+                <w:b/>
+                <w:sz w:val="26"/>
+                <w:szCs w:val="26"/>
+              </w:rPr>
+              <w:t>Phòng Kỹ Thuật và an toàn</w:t>
+            </w:r>
+          </w:p>
+        </w:tc>
+        <w:tc>
+          <w:tcPr>
+            <w:tcW w:w="4850" w:type="dxa"/>
+            <w:vAlign w:val="center"/>
+          </w:tcPr>
+          <w:p>
+            <w:pPr>
+              <w:spacing w:after="0" w:line="276" w:lineRule="auto"/>
+              <w:jc w:val="center"/>
+            </w:pPr>
+            <w:r>
+              <w:rPr>
+                <w:rFonts w:ascii="Times New Roman" w:hAnsi="Times New Roman" w:cs="Times New Roman"/>
+                <w:b/>
+                <w:sz w:val="26"/>
+                <w:szCs w:val="26"/>
+              </w:rPr>
+              <w:t>Phân Xưởng Sửa chữa Cơ nhiệt</w:t>
+            </w:r>
+          </w:p>
+        </w:tc>
+      </w:tr>
+      <w:tr>
+        <w:tc>
+          <w:tcPr>
+            <w:tcW w:w="4850" w:type="dxa"/>
+            <w:vAlign w:val="center"/>
+          </w:tcPr>
           <w:p>
             <w:pPr>
               <w:spacing w:before="240" w:after="0" w:line="276" w:lineRule="auto"/>
               <w:jc w:val="center"/>
-            </w:pPr>
-            <w:r>
-              <w:rPr>
-                <w:rFonts w:ascii="Times New Roman" w:hAnsi="Times New Roman" w:cs="Times New Roman"/>
-                <w:b/>
-                <w:sz w:val="26"/>
-                <w:szCs w:val="26"/>
-              </w:rPr>
-              <w:t>Phòng Kỹ Thuật và an toàn</w:t>
+              <w:rPr>
+                <w:rFonts w:ascii="Times New Roman" w:hAnsi="Times New Roman" w:cs="Times New Roman"/>
+                <w:b/>
+                <w:sz w:val="26"/>
+                <w:szCs w:val="26"/>
+              </w:rPr>
+            </w:pPr>
+          </w:p>
+          <w:p>
+            <w:pPr>
+              <w:spacing w:before="240" w:after="0" w:line="276" w:lineRule="auto"/>
+              <w:jc w:val="center"/>
+              <w:rPr>
+                <w:rFonts w:ascii="Times New Roman" w:hAnsi="Times New Roman" w:cs="Times New Roman"/>
+                <w:b/>
+                <w:sz w:val="26"/>
+                <w:szCs w:val="26"/>
+              </w:rPr>
+            </w:pPr>
+            <w:r>
+              <w:rPr>
+                <w:rFonts w:ascii="Times New Roman" w:hAnsi="Times New Roman" w:cs="Times New Roman"/>
+                <w:b/>
+                <w:sz w:val="26"/>
+                <w:szCs w:val="26"/>
+              </w:rPr>
+              <w:t>Trống</w:t>
             </w:r>
           </w:p>
         </w:tc>
@@ -2075,22 +2104,91 @@
           </w:tcPr>
           <w:p>
             <w:pPr>
-              <w:spacing w:after="0" w:line="276" w:lineRule="auto"/>
-            </w:pPr>
-          </w:p>
-          <w:p>
-            <w:pPr>
               <w:spacing w:before="240" w:after="0" w:line="276" w:lineRule="auto"/>
               <w:jc w:val="center"/>
-            </w:pPr>
-            <w:r>
-              <w:rPr>
-                <w:rFonts w:ascii="Times New Roman" w:hAnsi="Times New Roman" w:cs="Times New Roman"/>
-                <w:b/>
-                <w:sz w:val="26"/>
-                <w:szCs w:val="26"/>
-              </w:rPr>
-              <w:t>Phân Xưởng Sửa chữa Cơ nhiệt</w:t>
+              <w:rPr>
+                <w:rFonts w:ascii="Times New Roman" w:hAnsi="Times New Roman" w:cs="Times New Roman"/>
+                <w:b/>
+                <w:sz w:val="26"/>
+                <w:szCs w:val="26"/>
+              </w:rPr>
+            </w:pPr>
+          </w:p>
+          <w:p>
+            <w:pPr>
+              <w:spacing w:before="240" w:after="0" w:line="276" w:lineRule="auto"/>
+              <w:jc w:val="center"/>
+              <w:rPr>
+                <w:rFonts w:ascii="Times New Roman" w:hAnsi="Times New Roman" w:cs="Times New Roman"/>
+                <w:b/>
+                <w:sz w:val="26"/>
+                <w:szCs w:val="26"/>
+              </w:rPr>
+            </w:pPr>
+            <w:r>
+              <w:rPr>
+                <w:rFonts w:ascii="Times New Roman" w:hAnsi="Times New Roman" w:cs="Times New Roman"/>
+                <w:b/>
+                <w:sz w:val="26"/>
+                <w:szCs w:val="26"/>
+              </w:rPr>
+              <w:t>Trống</w:t>
+            </w:r>
+          </w:p>
+        </w:tc>
+      </w:tr>
+      <w:tr>
+        <w:tc>
+          <w:tcPr>
+            <w:tcW w:w="4850" w:type="dxa"/>
+            <w:vAlign w:val="center"/>
+          </w:tcPr>
+          <w:p>
+            <w:pPr>
+              <w:spacing w:before="240" w:after="0" w:line="276" w:lineRule="auto"/>
+              <w:jc w:val="center"/>
+              <w:rPr>
+                <w:rFonts w:ascii="Times New Roman" w:hAnsi="Times New Roman" w:cs="Times New Roman"/>
+                <w:b/>
+                <w:sz w:val="26"/>
+                <w:szCs w:val="26"/>
+              </w:rPr>
+            </w:pPr>
+            <w:r>
+              <w:rPr>
+                <w:rFonts w:ascii="Times New Roman" w:hAnsi="Times New Roman" w:cs="Times New Roman"/>
+                <w:b/>
+                <w:sz w:val="26"/>
+                <w:szCs w:val="26"/>
+              </w:rPr>
+              <w:t>Trống</w:t>
+            </w:r>
+          </w:p>
+        </w:tc>
+        <w:tc>
+          <w:tcPr>
+            <w:tcW w:w="4850" w:type="dxa"/>
+            <w:vAlign w:val="center"/>
+          </w:tcPr>
+          <w:p>
+            <w:pPr>
+              <w:spacing w:before="240" w:after="0" w:line="276" w:lineRule="auto"/>
+              <w:jc w:val="center"/>
+              <w:rPr>
+                <w:rFonts w:ascii="Times New Roman" w:hAnsi="Times New Roman" w:cs="Times New Roman"/>
+                <w:b/>
+                <w:sz w:val="26"/>
+                <w:szCs w:val="26"/>
+              </w:rPr>
+            </w:pPr>
+            <w:r>
+              <w:rPr>
+                <w:rFonts w:ascii="Times New Roman" w:hAnsi="Times New Roman" w:cs="Times New Roman"/>
+                <w:b/>
+                <w:sz w:val="26"/>
+                <w:szCs w:val="26"/>
+              </w:rPr>
+              <w:t>Trống</w:t>
             </w:r>
           </w:p>
         </w:tc>
@@ -2218,12 +2316,6 @@
         <w:gridCol w:w="1191"/>
       </w:tblGrid>
       <w:tr>
-        <w:tblPrEx>
-          <w:tblCellMar>
-            <w:top w:w="0" w:type="dxa"/>
-            <w:bottom w:w="0" w:type="dxa"/>
-          </w:tblCellMar>
-        </w:tblPrEx>
         <w:tc>
           <w:tcPr>
             <w:tcW w:w="560" w:type="dxa"/>
@@ -2529,12 +2621,6 @@
         </w:tc>
       </w:tr>
       <w:tr>
-        <w:tblPrEx>
-          <w:tblCellMar>
-            <w:top w:w="0" w:type="dxa"/>
-            <w:bottom w:w="0" w:type="dxa"/>
-          </w:tblCellMar>
-        </w:tblPrEx>
         <w:tc>
           <w:tcPr>
             <w:tcW w:w="560" w:type="dxa"/>

</xml_diff>